<commit_message>
Rearrange the UI to prepare for the Whack-A-Mole game.
</commit_message>
<xml_diff>
--- a/Activity5/CST-250 Activity5_ChadGalloway.docx
+++ b/Activity5/CST-250 Activity5_ChadGalloway.docx
@@ -211,31 +211,38 @@
         <w:br w:type="page"/>
       </w:r>
     </w:p>
-    <w:p/>
-    <w:p>
-      <w:pPr>
-        <w:jc w:val="center"/>
+    <w:p>
+      <w:pPr>
+        <w:jc w:val="center"/>
+        <w:rPr>
+          <w:lang w:val="en-US"/>
+        </w:rPr>
+      </w:pPr>
+      <w:r>
         <w:rPr>
           <w:b/>
           <w:sz w:val="28"/>
           <w:szCs w:val="28"/>
         </w:rPr>
-      </w:pPr>
+        <w:lastRenderedPageBreak/>
+        <w:t>Part 1</w:t>
+      </w:r>
       <w:r>
         <w:rPr>
           <w:b/>
           <w:sz w:val="28"/>
           <w:szCs w:val="28"/>
         </w:rPr>
-        <w:t>Part 1</w:t>
-      </w:r>
-    </w:p>
-    <w:p>
-      <w:pPr>
-        <w:rPr>
-          <w:lang w:val="en-US"/>
-        </w:rPr>
-      </w:pPr>
+        <w:t xml:space="preserve"> Activity</w:t>
+      </w:r>
+      <w:r>
+        <w:rPr>
+          <w:b/>
+          <w:sz w:val="28"/>
+          <w:szCs w:val="28"/>
+        </w:rPr>
+        <w:t xml:space="preserve"> Submission</w:t>
+      </w:r>
     </w:p>
     <w:p>
       <w:pPr>
@@ -312,7 +319,13 @@
         <w:jc w:val="center"/>
       </w:pPr>
       <w:r>
-        <w:t>Figure X: Flow chart of XXXXXXX</w:t>
+        <w:t xml:space="preserve">Figure </w:t>
+      </w:r>
+      <w:r>
+        <w:t>1-1</w:t>
+      </w:r>
+      <w:r>
+        <w:t>: Flow chart of XXXXXXX</w:t>
       </w:r>
     </w:p>
     <w:p>
@@ -409,7 +422,13 @@
         <w:jc w:val="center"/>
       </w:pPr>
       <w:r>
-        <w:t>Figure X: UML Class Diagram</w:t>
+        <w:t xml:space="preserve">Figure </w:t>
+      </w:r>
+      <w:r>
+        <w:t>1-2</w:t>
+      </w:r>
+      <w:r>
+        <w:t>: UML Class Diagram</w:t>
       </w:r>
     </w:p>
     <w:p>
@@ -459,6 +478,22 @@
           <w:szCs w:val="28"/>
         </w:rPr>
         <w:lastRenderedPageBreak/>
+        <w:t>Section 1 – Timer Control</w:t>
+      </w:r>
+    </w:p>
+    <w:p>
+      <w:pPr>
+        <w:jc w:val="center"/>
+        <w:rPr>
+          <w:sz w:val="28"/>
+          <w:szCs w:val="28"/>
+        </w:rPr>
+      </w:pPr>
+      <w:r>
+        <w:rPr>
+          <w:sz w:val="28"/>
+          <w:szCs w:val="28"/>
+        </w:rPr>
         <w:t>Screen Shots</w:t>
       </w:r>
     </w:p>
@@ -480,21 +515,28 @@
           <w:noProof/>
         </w:rPr>
         <w:drawing>
-          <wp:inline distT="114300" distB="114300" distL="114300" distR="114300" wp14:anchorId="05AB9AB9" wp14:editId="235B7011">
-            <wp:extent cx="3148013" cy="1796373"/>
+          <wp:inline distT="114300" distB="114300" distL="114300" distR="114300" wp14:anchorId="05AB9AB9" wp14:editId="56ADDCCF">
+            <wp:extent cx="2971800" cy="3200400"/>
             <wp:effectExtent l="0" t="0" r="0" b="0"/>
             <wp:docPr id="3" name="image1.jpg"/>
-            <wp:cNvGraphicFramePr/>
+            <wp:cNvGraphicFramePr>
+              <a:graphicFrameLocks xmlns:a="http://schemas.openxmlformats.org/drawingml/2006/main" noChangeAspect="1"/>
+            </wp:cNvGraphicFramePr>
             <a:graphic xmlns:a="http://schemas.openxmlformats.org/drawingml/2006/main">
               <a:graphicData uri="http://schemas.openxmlformats.org/drawingml/2006/picture">
                 <pic:pic xmlns:pic="http://schemas.openxmlformats.org/drawingml/2006/picture">
                   <pic:nvPicPr>
-                    <pic:cNvPr id="0" name="image1.jpg"/>
-                    <pic:cNvPicPr preferRelativeResize="0"/>
+                    <pic:cNvPr id="3" name="image1.jpg"/>
+                    <pic:cNvPicPr/>
                   </pic:nvPicPr>
                   <pic:blipFill>
-                    <a:blip r:embed="rId5"/>
-                    <a:srcRect/>
+                    <a:blip r:embed="rId6">
+                      <a:extLst>
+                        <a:ext uri="{28A0092B-C50C-407E-A947-70E740481C1C}">
+                          <a14:useLocalDpi xmlns:a14="http://schemas.microsoft.com/office/drawing/2010/main" val="0"/>
+                        </a:ext>
+                      </a:extLst>
+                    </a:blip>
                     <a:stretch>
                       <a:fillRect/>
                     </a:stretch>
@@ -502,7 +544,7 @@
                   <pic:spPr>
                     <a:xfrm>
                       <a:off x="0" y="0"/>
-                      <a:ext cx="3148013" cy="1796373"/>
+                      <a:ext cx="2971800" cy="3200400"/>
                     </a:xfrm>
                     <a:prstGeom prst="rect">
                       <a:avLst/>
@@ -521,41 +563,22 @@
         <w:jc w:val="center"/>
       </w:pPr>
       <w:r>
-        <w:t>Figure X: Part 1 App Running</w:t>
-      </w:r>
-    </w:p>
-    <w:p>
-      <w:pPr>
-        <w:jc w:val="center"/>
-      </w:pPr>
-    </w:p>
-    <w:p>
-      <w:pPr>
-        <w:rPr>
-          <w:lang w:val="en-US"/>
-        </w:rPr>
-      </w:pPr>
-      <w:r>
-        <w:rPr>
-          <w:lang w:val="en-US"/>
-        </w:rPr>
-        <w:t xml:space="preserve">Lorem ipsum dolor sit amet, consectetur adipiscing elit, sed do eiusmod tempor incididunt ut labore et dolore magna aliqua. </w:t>
-      </w:r>
-      <w:r>
-        <w:rPr>
-          <w:lang w:val="pt-BR"/>
-        </w:rPr>
-        <w:t xml:space="preserve">Ut enim ad minim veniam, quis nostrud exercitation ullamco laboris nisi ut aliquip ex ea commodo consequat. </w:t>
-      </w:r>
-      <w:r>
-        <w:rPr>
-          <w:lang w:val="en-US"/>
-        </w:rPr>
-        <w:t>Duis aute irure dolor in reprehenderit in voluptate velit esse cillum dolore eu fugiat nulla pariatur. Excepteur sint occaecat cupidatat non proident, sunt in culpa qui officia deserunt mollit anim id est laborum.</w:t>
+        <w:t xml:space="preserve">Figure </w:t>
+      </w:r>
+      <w:r>
+        <w:t>1-3</w:t>
+      </w:r>
+      <w:r>
+        <w:t xml:space="preserve">: </w:t>
+      </w:r>
+      <w:r>
+        <w:t>Section</w:t>
+      </w:r>
+      <w:r>
+        <w:t xml:space="preserve"> 1 App Running</w:t>
       </w:r>
     </w:p>
     <w:p/>
-    <w:p/>
     <w:p>
       <w:pPr>
         <w:jc w:val="center"/>
@@ -574,21 +597,28 @@
           <w:noProof/>
         </w:rPr>
         <w:drawing>
-          <wp:inline distT="114300" distB="114300" distL="114300" distR="114300" wp14:anchorId="6D4325D3" wp14:editId="440EF182">
-            <wp:extent cx="3148013" cy="1796373"/>
-            <wp:effectExtent l="0" t="0" r="0" b="0"/>
+          <wp:inline distT="114300" distB="114300" distL="114300" distR="114300" wp14:anchorId="6D4325D3" wp14:editId="1048DF5E">
+            <wp:extent cx="2926080" cy="3200400"/>
+            <wp:effectExtent l="0" t="0" r="7620" b="0"/>
             <wp:docPr id="547260474" name="image1.jpg"/>
-            <wp:cNvGraphicFramePr/>
+            <wp:cNvGraphicFramePr>
+              <a:graphicFrameLocks xmlns:a="http://schemas.openxmlformats.org/drawingml/2006/main" noChangeAspect="1"/>
+            </wp:cNvGraphicFramePr>
             <a:graphic xmlns:a="http://schemas.openxmlformats.org/drawingml/2006/main">
               <a:graphicData uri="http://schemas.openxmlformats.org/drawingml/2006/picture">
                 <pic:pic xmlns:pic="http://schemas.openxmlformats.org/drawingml/2006/picture">
                   <pic:nvPicPr>
-                    <pic:cNvPr id="0" name="image1.jpg"/>
-                    <pic:cNvPicPr preferRelativeResize="0"/>
+                    <pic:cNvPr id="547260474" name="image1.jpg"/>
+                    <pic:cNvPicPr/>
                   </pic:nvPicPr>
                   <pic:blipFill>
-                    <a:blip r:embed="rId5"/>
-                    <a:srcRect/>
+                    <a:blip r:embed="rId7">
+                      <a:extLst>
+                        <a:ext uri="{28A0092B-C50C-407E-A947-70E740481C1C}">
+                          <a14:useLocalDpi xmlns:a14="http://schemas.microsoft.com/office/drawing/2010/main" val="0"/>
+                        </a:ext>
+                      </a:extLst>
+                    </a:blip>
                     <a:stretch>
                       <a:fillRect/>
                     </a:stretch>
@@ -596,7 +626,7 @@
                   <pic:spPr>
                     <a:xfrm>
                       <a:off x="0" y="0"/>
-                      <a:ext cx="3148013" cy="1796373"/>
+                      <a:ext cx="2926080" cy="3200400"/>
                     </a:xfrm>
                     <a:prstGeom prst="rect">
                       <a:avLst/>
@@ -615,21 +645,19 @@
         <w:jc w:val="center"/>
       </w:pPr>
       <w:r>
-        <w:t>Figure X: Screenshot of successful output</w:t>
-      </w:r>
-    </w:p>
-    <w:p>
-      <w:pPr>
-        <w:jc w:val="center"/>
-      </w:pPr>
-    </w:p>
-    <w:p>
-      <w:r>
-        <w:rPr>
-          <w:lang w:val="en-US"/>
-        </w:rPr>
-        <w:t>Lorem ipsum dolor sit amet, consectetur adipiscing elit, sed do eiusmod tempor incididunt ut labore et dolore magna aliqua. Ut enim ad minim veniam, quis nostrud exercitation ullamco laboris nisi ut aliquip ex ea commodo consequat. Duis aute irure dolor in reprehenderit in voluptate velit esse cillum dolore eu fugiat nulla pariatur. Excepteur sint occaecat cupidatat non proident, sunt in culpa qui officia deserunt mollit anim id est laborum.</w:t>
-      </w:r>
+        <w:t xml:space="preserve">Figure </w:t>
+      </w:r>
+      <w:r>
+        <w:t>1-4</w:t>
+      </w:r>
+      <w:r>
+        <w:t>: Screenshot of successful output</w:t>
+      </w:r>
+    </w:p>
+    <w:p>
+      <w:pPr>
+        <w:jc w:val="center"/>
+      </w:pPr>
     </w:p>
     <w:p/>
     <w:p/>
@@ -641,23 +669,29 @@
         <w:rPr>
           <w:noProof/>
         </w:rPr>
-        <w:lastRenderedPageBreak/>
         <w:drawing>
-          <wp:inline distT="114300" distB="114300" distL="114300" distR="114300" wp14:anchorId="0C53EAC3" wp14:editId="0A61E8D9">
-            <wp:extent cx="3148013" cy="1796373"/>
+          <wp:inline distT="114300" distB="114300" distL="114300" distR="114300" wp14:anchorId="0C53EAC3" wp14:editId="5647950E">
+            <wp:extent cx="5943600" cy="1170432"/>
             <wp:effectExtent l="0" t="0" r="0" b="0"/>
             <wp:docPr id="984152048" name="image1.jpg"/>
-            <wp:cNvGraphicFramePr/>
+            <wp:cNvGraphicFramePr>
+              <a:graphicFrameLocks xmlns:a="http://schemas.openxmlformats.org/drawingml/2006/main" noChangeAspect="1"/>
+            </wp:cNvGraphicFramePr>
             <a:graphic xmlns:a="http://schemas.openxmlformats.org/drawingml/2006/main">
               <a:graphicData uri="http://schemas.openxmlformats.org/drawingml/2006/picture">
                 <pic:pic xmlns:pic="http://schemas.openxmlformats.org/drawingml/2006/picture">
                   <pic:nvPicPr>
-                    <pic:cNvPr id="0" name="image1.jpg"/>
-                    <pic:cNvPicPr preferRelativeResize="0"/>
+                    <pic:cNvPr id="984152048" name="image1.jpg"/>
+                    <pic:cNvPicPr/>
                   </pic:nvPicPr>
                   <pic:blipFill>
-                    <a:blip r:embed="rId5"/>
-                    <a:srcRect/>
+                    <a:blip r:embed="rId8" cstate="print">
+                      <a:extLst>
+                        <a:ext uri="{28A0092B-C50C-407E-A947-70E740481C1C}">
+                          <a14:useLocalDpi xmlns:a14="http://schemas.microsoft.com/office/drawing/2010/main" val="0"/>
+                        </a:ext>
+                      </a:extLst>
+                    </a:blip>
                     <a:stretch>
                       <a:fillRect/>
                     </a:stretch>
@@ -665,7 +699,7 @@
                   <pic:spPr>
                     <a:xfrm>
                       <a:off x="0" y="0"/>
-                      <a:ext cx="3148013" cy="1796373"/>
+                      <a:ext cx="5943600" cy="1170432"/>
                     </a:xfrm>
                     <a:prstGeom prst="rect">
                       <a:avLst/>
@@ -684,77 +718,21 @@
         <w:jc w:val="center"/>
       </w:pPr>
       <w:r>
-        <w:t>Figure X: Screenshot of Error Handling</w:t>
-      </w:r>
-    </w:p>
-    <w:p>
-      <w:pPr>
-        <w:jc w:val="center"/>
-      </w:pPr>
-    </w:p>
-    <w:p>
-      <w:r>
-        <w:rPr>
-          <w:lang w:val="en-US"/>
-        </w:rPr>
-        <w:t>Lorem ipsum dolor sit amet, consectetur adipiscing elit, sed do eiusmod tempor incididunt ut labore et dolore magna aliqua. Ut enim ad minim veniam, quis nostrud exercitation ullamco laboris nisi ut aliquip ex ea commodo consequat. Duis aute irure dolor in reprehenderit in voluptate velit esse cillum dolore eu fugiat nulla pariatur. Excepteur sint occaecat cupidatat non proident, sunt in culpa qui officia deserunt mollit anim id est laborum.</w:t>
-      </w:r>
-    </w:p>
-    <w:p/>
-    <w:p>
-      <w:r>
-        <w:br w:type="page"/>
-      </w:r>
-    </w:p>
-    <w:p/>
-    <w:p>
-      <w:pPr>
-        <w:jc w:val="center"/>
-        <w:rPr>
-          <w:b/>
-          <w:sz w:val="28"/>
-          <w:szCs w:val="28"/>
-        </w:rPr>
-      </w:pPr>
-      <w:r>
-        <w:rPr>
-          <w:b/>
-          <w:sz w:val="28"/>
-          <w:szCs w:val="28"/>
-        </w:rPr>
-        <w:t>Part 2</w:t>
-      </w:r>
-    </w:p>
-    <w:p>
-      <w:pPr>
-        <w:rPr>
-          <w:lang w:val="en-US"/>
-        </w:rPr>
-      </w:pPr>
-    </w:p>
-    <w:p>
-      <w:pPr>
-        <w:jc w:val="center"/>
-        <w:rPr>
-          <w:sz w:val="28"/>
-          <w:szCs w:val="28"/>
-        </w:rPr>
-      </w:pPr>
-      <w:r>
-        <w:rPr>
-          <w:sz w:val="28"/>
-          <w:szCs w:val="28"/>
-        </w:rPr>
-        <w:t>FLOW CHART</w:t>
-      </w:r>
-    </w:p>
-    <w:p>
-      <w:pPr>
-        <w:jc w:val="center"/>
-        <w:rPr>
-          <w:sz w:val="28"/>
-          <w:szCs w:val="28"/>
-        </w:rPr>
+        <w:t xml:space="preserve">Figure </w:t>
+      </w:r>
+      <w:r>
+        <w:t>1-5</w:t>
+      </w:r>
+      <w:r>
+        <w:t xml:space="preserve">: </w:t>
+      </w:r>
+      <w:r>
+        <w:t>WhackAMole citations and constructor</w:t>
+      </w:r>
+    </w:p>
+    <w:p>
+      <w:pPr>
+        <w:jc w:val="center"/>
       </w:pPr>
     </w:p>
     <w:p>
@@ -766,21 +744,28 @@
           <w:noProof/>
         </w:rPr>
         <w:drawing>
-          <wp:inline distT="114300" distB="114300" distL="114300" distR="114300" wp14:anchorId="12BAE9EA" wp14:editId="27AC631E">
-            <wp:extent cx="3148013" cy="1796373"/>
+          <wp:inline distT="114300" distB="114300" distL="114300" distR="114300" wp14:anchorId="0489B503" wp14:editId="34B31C0B">
+            <wp:extent cx="5943600" cy="2953512"/>
             <wp:effectExtent l="0" t="0" r="0" b="0"/>
-            <wp:docPr id="1672752189" name="image1.jpg"/>
-            <wp:cNvGraphicFramePr/>
+            <wp:docPr id="2093112809" name="image1.jpg"/>
+            <wp:cNvGraphicFramePr>
+              <a:graphicFrameLocks xmlns:a="http://schemas.openxmlformats.org/drawingml/2006/main" noChangeAspect="1"/>
+            </wp:cNvGraphicFramePr>
             <a:graphic xmlns:a="http://schemas.openxmlformats.org/drawingml/2006/main">
               <a:graphicData uri="http://schemas.openxmlformats.org/drawingml/2006/picture">
                 <pic:pic xmlns:pic="http://schemas.openxmlformats.org/drawingml/2006/picture">
                   <pic:nvPicPr>
-                    <pic:cNvPr id="0" name="image1.jpg"/>
-                    <pic:cNvPicPr preferRelativeResize="0"/>
+                    <pic:cNvPr id="2093112809" name="image1.jpg"/>
+                    <pic:cNvPicPr/>
                   </pic:nvPicPr>
                   <pic:blipFill>
-                    <a:blip r:embed="rId5"/>
-                    <a:srcRect/>
+                    <a:blip r:embed="rId9" cstate="print">
+                      <a:extLst>
+                        <a:ext uri="{28A0092B-C50C-407E-A947-70E740481C1C}">
+                          <a14:useLocalDpi xmlns:a14="http://schemas.microsoft.com/office/drawing/2010/main" val="0"/>
+                        </a:ext>
+                      </a:extLst>
+                    </a:blip>
                     <a:stretch>
                       <a:fillRect/>
                     </a:stretch>
@@ -788,7 +773,7 @@
                   <pic:spPr>
                     <a:xfrm>
                       <a:off x="0" y="0"/>
-                      <a:ext cx="3148013" cy="1796373"/>
+                      <a:ext cx="5943600" cy="2953512"/>
                     </a:xfrm>
                     <a:prstGeom prst="rect">
                       <a:avLst/>
@@ -807,77 +792,53 @@
         <w:jc w:val="center"/>
       </w:pPr>
       <w:r>
-        <w:t>Figure X: Flow chart of XXXXXXX</w:t>
-      </w:r>
-    </w:p>
-    <w:p>
-      <w:pPr>
-        <w:jc w:val="center"/>
-      </w:pPr>
-    </w:p>
-    <w:p>
-      <w:r>
-        <w:rPr>
-          <w:lang w:val="en-US"/>
-        </w:rPr>
-        <w:t>"Lorem ipsum dolor sit amet, consectetur adipiscing elit, sed do eiusmod tempor incididunt ut labore et dolore magna aliqua. Ut enim ad minim veniam, quis nostrud exercitation ullamco laboris nisi ut aliquip ex ea commodo consequat. Duis aute irure dolor in reprehenderit in voluptate velit esse cillum dolore eu fugiat nulla pariatur. Excepteur sint occaecat cupidatat non proident, sunt in culpa qui officia deserunt mollit anim id est laborum."</w:t>
-      </w:r>
-    </w:p>
-    <w:p>
-      <w:r>
-        <w:br w:type="page"/>
+        <w:t xml:space="preserve">Figure </w:t>
+      </w:r>
+      <w:r>
+        <w:t>1-6</w:t>
+      </w:r>
+      <w:r>
+        <w:t xml:space="preserve">: </w:t>
+      </w:r>
+      <w:r>
+        <w:t>WhackAMole</w:t>
+      </w:r>
+      <w:r>
+        <w:t xml:space="preserve"> event handlers</w:t>
       </w:r>
     </w:p>
     <w:p/>
     <w:p>
       <w:pPr>
         <w:jc w:val="center"/>
-        <w:rPr>
-          <w:sz w:val="28"/>
-          <w:szCs w:val="28"/>
-        </w:rPr>
-      </w:pPr>
-      <w:r>
-        <w:rPr>
-          <w:sz w:val="28"/>
-          <w:szCs w:val="28"/>
-        </w:rPr>
-        <w:t>UML Class Diagram</w:t>
-      </w:r>
-    </w:p>
-    <w:p>
-      <w:pPr>
-        <w:jc w:val="center"/>
-        <w:rPr>
-          <w:sz w:val="28"/>
-          <w:szCs w:val="28"/>
-        </w:rPr>
-      </w:pPr>
-    </w:p>
-    <w:p>
-      <w:pPr>
-        <w:jc w:val="center"/>
       </w:pPr>
       <w:r>
         <w:rPr>
           <w:noProof/>
         </w:rPr>
         <w:drawing>
-          <wp:inline distT="114300" distB="114300" distL="114300" distR="114300" wp14:anchorId="1B6336B7" wp14:editId="4836C287">
-            <wp:extent cx="3148013" cy="1796373"/>
+          <wp:inline distT="114300" distB="114300" distL="114300" distR="114300" wp14:anchorId="7156AF8F" wp14:editId="149EF029">
+            <wp:extent cx="3200400" cy="2615184"/>
             <wp:effectExtent l="0" t="0" r="0" b="0"/>
-            <wp:docPr id="425721919" name="image1.jpg"/>
-            <wp:cNvGraphicFramePr/>
+            <wp:docPr id="268276801" name="image1.jpg"/>
+            <wp:cNvGraphicFramePr>
+              <a:graphicFrameLocks xmlns:a="http://schemas.openxmlformats.org/drawingml/2006/main" noChangeAspect="1"/>
+            </wp:cNvGraphicFramePr>
             <a:graphic xmlns:a="http://schemas.openxmlformats.org/drawingml/2006/main">
               <a:graphicData uri="http://schemas.openxmlformats.org/drawingml/2006/picture">
                 <pic:pic xmlns:pic="http://schemas.openxmlformats.org/drawingml/2006/picture">
                   <pic:nvPicPr>
-                    <pic:cNvPr id="0" name="image1.jpg"/>
-                    <pic:cNvPicPr preferRelativeResize="0"/>
+                    <pic:cNvPr id="268276801" name="image1.jpg"/>
+                    <pic:cNvPicPr/>
                   </pic:nvPicPr>
                   <pic:blipFill>
-                    <a:blip r:embed="rId5"/>
-                    <a:srcRect/>
+                    <a:blip r:embed="rId10">
+                      <a:extLst>
+                        <a:ext uri="{28A0092B-C50C-407E-A947-70E740481C1C}">
+                          <a14:useLocalDpi xmlns:a14="http://schemas.microsoft.com/office/drawing/2010/main" val="0"/>
+                        </a:ext>
+                      </a:extLst>
+                    </a:blip>
                     <a:stretch>
                       <a:fillRect/>
                     </a:stretch>
@@ -885,7 +846,7 @@
                   <pic:spPr>
                     <a:xfrm>
                       <a:off x="0" y="0"/>
-                      <a:ext cx="3148013" cy="1796373"/>
+                      <a:ext cx="3200400" cy="2615184"/>
                     </a:xfrm>
                     <a:prstGeom prst="rect">
                       <a:avLst/>
@@ -904,40 +865,13 @@
         <w:jc w:val="center"/>
       </w:pPr>
       <w:r>
-        <w:t>Figure X: UML Class Diagram</w:t>
-      </w:r>
-    </w:p>
-    <w:p>
-      <w:pPr>
-        <w:jc w:val="center"/>
-      </w:pPr>
-    </w:p>
-    <w:p>
-      <w:r>
-        <w:rPr>
-          <w:lang w:val="en-US"/>
-        </w:rPr>
-        <w:t xml:space="preserve">Lorem ipsum dolor sit amet, consectetur adipiscing elit, sed do eiusmod tempor incididunt ut labore et dolore magna aliqua. </w:t>
-      </w:r>
-      <w:r>
-        <w:rPr>
-          <w:lang w:val="pt-BR"/>
-        </w:rPr>
-        <w:t xml:space="preserve">Ut enim ad minim veniam, quis nostrud exercitation ullamco laboris nisi ut aliquip ex ea commodo consequat. </w:t>
-      </w:r>
-      <w:r>
-        <w:rPr>
-          <w:lang w:val="en-US"/>
-        </w:rPr>
-        <w:t>Duis aute irure dolor in reprehenderit in voluptate velit esse cillum dolore eu fugiat nulla pariatur. Excepteur sint occaecat cupidatat non proident, sunt in culpa qui officia deserunt mollit anim id est laborum.</w:t>
-      </w:r>
-    </w:p>
-    <w:p>
-      <w:pPr>
-        <w:jc w:val="center"/>
-      </w:pPr>
-      <w:r>
-        <w:br w:type="page"/>
+        <w:t xml:space="preserve">Figure </w:t>
+      </w:r>
+      <w:r>
+        <w:t>1-7</w:t>
+      </w:r>
+      <w:r>
+        <w:t>: Screenshot of Error Handling</w:t>
       </w:r>
     </w:p>
     <w:p>
@@ -954,6 +888,57 @@
           <w:szCs w:val="28"/>
         </w:rPr>
         <w:lastRenderedPageBreak/>
+        <w:t xml:space="preserve">Section </w:t>
+      </w:r>
+      <w:r>
+        <w:rPr>
+          <w:sz w:val="28"/>
+          <w:szCs w:val="28"/>
+        </w:rPr>
+        <w:t>2</w:t>
+      </w:r>
+      <w:r>
+        <w:rPr>
+          <w:sz w:val="28"/>
+          <w:szCs w:val="28"/>
+        </w:rPr>
+        <w:t xml:space="preserve"> – </w:t>
+      </w:r>
+      <w:r>
+        <w:rPr>
+          <w:sz w:val="28"/>
+          <w:szCs w:val="28"/>
+        </w:rPr>
+        <w:t>Create a “Whack-a-Mole</w:t>
+      </w:r>
+      <w:r>
+        <w:rPr>
+          <w:sz w:val="28"/>
+          <w:szCs w:val="28"/>
+        </w:rPr>
+        <w:t>”</w:t>
+      </w:r>
+      <w:r>
+        <w:rPr>
+          <w:sz w:val="28"/>
+          <w:szCs w:val="28"/>
+        </w:rPr>
+        <w:t xml:space="preserve"> Game</w:t>
+      </w:r>
+    </w:p>
+    <w:p>
+      <w:pPr>
+        <w:jc w:val="center"/>
+        <w:rPr>
+          <w:sz w:val="28"/>
+          <w:szCs w:val="28"/>
+        </w:rPr>
+      </w:pPr>
+      <w:r>
+        <w:rPr>
+          <w:sz w:val="28"/>
+          <w:szCs w:val="28"/>
+        </w:rPr>
         <w:t>Screen Shots</w:t>
       </w:r>
     </w:p>
@@ -1016,7 +1001,13 @@
         <w:jc w:val="center"/>
       </w:pPr>
       <w:r>
-        <w:t>Figure X: Part 2 App Running</w:t>
+        <w:t xml:space="preserve">Figure </w:t>
+      </w:r>
+      <w:r>
+        <w:t>2-1</w:t>
+      </w:r>
+      <w:r>
+        <w:t>: Part 2 App Running</w:t>
       </w:r>
     </w:p>
     <w:p>
@@ -1110,7 +1101,13 @@
         <w:jc w:val="center"/>
       </w:pPr>
       <w:r>
-        <w:t>Figure X: Screenshot of successful output</w:t>
+        <w:t xml:space="preserve">Figure </w:t>
+      </w:r>
+      <w:r>
+        <w:t>2-2</w:t>
+      </w:r>
+      <w:r>
+        <w:t>: Screenshot of successful output</w:t>
       </w:r>
     </w:p>
     <w:p>

</xml_diff>